<commit_message>
add new sprites, new anim, new main_screen
</commit_message>
<xml_diff>
--- a/Uzivatelska_Dokumentace.docx
+++ b/Uzivatelska_Dokumentace.docx
@@ -14,17 +14,14 @@
       <w:pPr>
         <w:pStyle w:val="Nadpis2"/>
       </w:pPr>
-      <w:proofErr w:type="spellStart"/>
       <w:r>
         <w:t>Neonexa</w:t>
       </w:r>
-      <w:proofErr w:type="spellEnd"/>
     </w:p>
     <w:p>
       <w:r>
         <w:t xml:space="preserve">Autor: </w:t>
       </w:r>
-      <w:proofErr w:type="spellStart"/>
       <w:r>
         <w:t>Vojt</w:t>
       </w:r>
@@ -32,23 +29,8 @@
         <w:rPr>
           <w:lang w:val="en-US"/>
         </w:rPr>
-        <w:t>ěch</w:t>
-      </w:r>
-      <w:proofErr w:type="spellEnd"/>
-      <w:r>
-        <w:rPr>
-          <w:lang w:val="en-US"/>
-        </w:rPr>
-        <w:t xml:space="preserve"> </w:t>
-      </w:r>
-      <w:proofErr w:type="spellStart"/>
-      <w:r>
-        <w:rPr>
-          <w:lang w:val="en-US"/>
-        </w:rPr>
-        <w:t>Peňák</w:t>
-      </w:r>
-      <w:proofErr w:type="spellEnd"/>
+        <w:t>ěch Peňák</w:t>
+      </w:r>
       <w:r>
         <w:br/>
         <w:t>Školní rok: 2025/2026</w:t>
@@ -59,22 +41,7 @@
       </w:r>
       <w:r>
         <w:br/>
-      </w:r>
-      <w:proofErr w:type="spellStart"/>
-      <w:r>
-        <w:t>Engine</w:t>
-      </w:r>
-      <w:proofErr w:type="spellEnd"/>
-      <w:r>
-        <w:t xml:space="preserve">: Godot </w:t>
-      </w:r>
-      <w:proofErr w:type="spellStart"/>
-      <w:r>
-        <w:t>Engine</w:t>
-      </w:r>
-      <w:proofErr w:type="spellEnd"/>
-      <w:r>
-        <w:t xml:space="preserve"> 4.x</w:t>
+        <w:t>Engine: Godot Engine 4.x</w:t>
       </w:r>
       <w:r>
         <w:t xml:space="preserve"> (4.5, 4.6)</w:t>
@@ -100,15 +67,7 @@
     </w:p>
     <w:p>
       <w:r>
-        <w:t xml:space="preserve">Tento dokument slouží jako uživatelský manuál ke hře </w:t>
-      </w:r>
-      <w:proofErr w:type="spellStart"/>
-      <w:r>
-        <w:t>Neonexa</w:t>
-      </w:r>
-      <w:proofErr w:type="spellEnd"/>
-      <w:r>
-        <w:t>. Je určen hráčům a popisuje způsob instalace, ovládání, základní herní mechaniky a fungování herního systému. Cílem je umožnit uživateli rychle pochopit princip hry a bez problémů ji spustit a hrát.</w:t>
+        <w:t>Tento dokument slouží jako uživatelský manuál ke hře Neonexa. Je určen hráčům a popisuje způsob instalace, ovládání, základní herní mechaniky a fungování herního systému. Cílem je umožnit uživateli rychle pochopit princip hry a bez problémů ji spustit a hrát.</w:t>
       </w:r>
       <w:r>
         <w:t xml:space="preserve"> K tomu je přidáno i více nějakých ostatních věcí.</w:t>
@@ -124,30 +83,26 @@
     </w:p>
     <w:p>
       <w:r>
-        <w:t xml:space="preserve">Hra je určena především hráčům osobních počítačů, kteří mají zájem o akční 2D tituly a zejména o žánr </w:t>
-      </w:r>
-      <w:proofErr w:type="spellStart"/>
-      <w:r>
-        <w:t>Metroidvania</w:t>
-      </w:r>
-      <w:proofErr w:type="spellEnd"/>
-      <w:r>
-        <w:t>. Oslovuje hráče, kteří vyhledávají atmosférické prostředí, postupné objevování světa, nelineární průchod úrovněmi a systém získávání nových schopností, jež umožňují návrat do dříve nepřístupných oblastí.</w:t>
-      </w:r>
-    </w:p>
-    <w:p>
-      <w:proofErr w:type="spellStart"/>
-      <w:r>
-        <w:t>Neonexa</w:t>
-      </w:r>
-      <w:proofErr w:type="spellEnd"/>
-      <w:r>
-        <w:t xml:space="preserve"> je vhodná jak pro zkušenější hráče, kteří mají s tímto žánrem předchozí zkušenost, tak i pro hráče, kteří se s podobným typem hry setkávají poprvé. Herní mechaniky jsou navrženy tak, aby byly intuitivní a postupně představované, což umožňuje přirozené osvojení ovládání i herních principů.</w:t>
+        <w:t>Hra je určena především hráčům osobních počítačů, kteří mají zájem o akční 2D tituly a zejména o žánr Metroidvania. Oslovuje hráče, kteří vyhledávají atmosférické prostředí, postupné objevování světa, nelineární průchod úrovněmi a systém získávání nových schopností, jež umožňují návrat do dříve nepřístupných oblastí.</w:t>
+      </w:r>
+    </w:p>
+    <w:p>
+      <w:r>
+        <w:t xml:space="preserve">Neonexa je vhodná jak </w:t>
+      </w:r>
+      <w:r>
+        <w:t>pro zkušenější hráče</w:t>
+      </w:r>
+      <w:r>
+        <w:t>, kteří mají s tímto žánrem předchozí zkušenost, tak i pro hráče, kteří se s podobným typem hry setkávají poprvé. Herní mechaniky jsou navrženy tak, aby byly intuitivní a postupně představované, což umožňuje přirozené osvojení ovládání i herních principů.</w:t>
       </w:r>
     </w:p>
     <w:p>
       <w:r>
         <w:t>Tento dokument je zpracován s cílem být srozumitelný širokému spektru uživatelů, tedy i osobám bez technického nebo herního zázemí. Popisy jsou formulovány přehledně a systematicky tak, aby hráč dokázal hru bez obtíží nainstalovat, spustit a pochopit její základní fungování.</w:t>
+      </w:r>
+      <w:r>
+        <w:t xml:space="preserve"> Tedy není přesný „guide“ krok po kroku.</w:t>
       </w:r>
     </w:p>
     <w:p/>
@@ -177,11 +132,9 @@
       </w:r>
     </w:p>
     <w:p>
-      <w:proofErr w:type="spellStart"/>
       <w:r>
         <w:t>Neonexa</w:t>
       </w:r>
-      <w:proofErr w:type="spellEnd"/>
     </w:p>
     <w:p>
       <w:pPr>
@@ -192,29 +145,8 @@
       </w:r>
     </w:p>
     <w:p>
-      <w:proofErr w:type="gramStart"/>
-      <w:r>
-        <w:t>2D</w:t>
-      </w:r>
-      <w:proofErr w:type="gramEnd"/>
-      <w:r>
-        <w:t xml:space="preserve"> akční </w:t>
-      </w:r>
-      <w:proofErr w:type="spellStart"/>
-      <w:r>
-        <w:t>adventura</w:t>
-      </w:r>
-      <w:proofErr w:type="spellEnd"/>
-      <w:r>
-        <w:t xml:space="preserve"> (</w:t>
-      </w:r>
-      <w:proofErr w:type="spellStart"/>
-      <w:r>
-        <w:t>Metroidvania</w:t>
-      </w:r>
-      <w:proofErr w:type="spellEnd"/>
-      <w:r>
-        <w:t>)</w:t>
+      <w:r>
+        <w:t>2D akční adventura (Metroidvania)</w:t>
       </w:r>
     </w:p>
     <w:p>
@@ -239,11 +171,9 @@
       </w:r>
     </w:p>
     <w:p>
-      <w:proofErr w:type="spellStart"/>
       <w:r>
         <w:t>Singleplayer</w:t>
       </w:r>
-      <w:proofErr w:type="spellEnd"/>
     </w:p>
     <w:p>
       <w:pPr>
@@ -254,29 +184,8 @@
       </w:r>
     </w:p>
     <w:p>
-      <w:proofErr w:type="spellStart"/>
-      <w:r>
-        <w:t>Neonexa</w:t>
-      </w:r>
-      <w:proofErr w:type="spellEnd"/>
-      <w:r>
-        <w:t xml:space="preserve"> je </w:t>
-      </w:r>
-      <w:proofErr w:type="gramStart"/>
-      <w:r>
-        <w:t>2D</w:t>
-      </w:r>
-      <w:proofErr w:type="gramEnd"/>
-      <w:r>
-        <w:t xml:space="preserve"> akční </w:t>
-      </w:r>
-      <w:proofErr w:type="spellStart"/>
-      <w:r>
-        <w:t>adventura</w:t>
-      </w:r>
-      <w:proofErr w:type="spellEnd"/>
-      <w:r>
-        <w:t xml:space="preserve"> odehrávající se ve futuristickém světě, kde technologie postupně pohlcuje přírodu. Hráč ovládá postavu mechanické bytosti</w:t>
+      <w:r>
+        <w:t>Neonexa je 2D akční adventura odehrávající se ve futuristickém světě, kde technologie postupně pohlcuje přírodu. Hráč ovládá postavu mechanické bytosti</w:t>
       </w:r>
       <w:r>
         <w:t xml:space="preserve"> (ještě nemám název)</w:t>
@@ -453,15 +362,7 @@
         </w:numPr>
       </w:pPr>
       <w:r>
-        <w:t xml:space="preserve">Grafická karta: Podpora </w:t>
-      </w:r>
-      <w:proofErr w:type="spellStart"/>
-      <w:r>
-        <w:t>OpenGL</w:t>
-      </w:r>
-      <w:proofErr w:type="spellEnd"/>
-      <w:r>
-        <w:t xml:space="preserve"> 3.3</w:t>
+        <w:t>Grafická karta: Podpora OpenGL 3.3</w:t>
       </w:r>
     </w:p>
     <w:p>
@@ -642,7 +543,7 @@
         </w:numPr>
       </w:pPr>
       <w:r>
-        <w:t>Ukazatel energie / duše</w:t>
+        <w:t>Ukazatel duše</w:t>
       </w:r>
     </w:p>
     <w:p>
@@ -680,26 +581,13 @@
         <w:t>Soul fragmenty slouží jako herní měna pro budoucí vylepšení.</w:t>
       </w:r>
     </w:p>
-    <w:p>
-      <w:pPr>
-        <w:ind w:firstLine="708"/>
-      </w:pPr>
-    </w:p>
-    <w:p>
-      <w:pPr>
-        <w:ind w:firstLine="708"/>
-      </w:pPr>
-    </w:p>
-    <w:p>
-      <w:pPr>
-        <w:ind w:firstLine="708"/>
-      </w:pPr>
-    </w:p>
+    <w:p/>
     <w:p>
       <w:pPr>
         <w:pStyle w:val="Nadpis2"/>
       </w:pPr>
       <w:r>
+        <w:lastRenderedPageBreak/>
         <w:t>6. Ovládání hry</w:t>
       </w:r>
     </w:p>
@@ -764,6 +652,17 @@
       </w:r>
     </w:p>
     <w:p>
+      <w:pPr>
+        <w:numPr>
+          <w:ilvl w:val="0"/>
+          <w:numId w:val="5"/>
+        </w:numPr>
+      </w:pPr>
+      <w:r>
+        <w:t>Dash – SHIFT</w:t>
+      </w:r>
+    </w:p>
+    <w:p>
       <w:r>
         <w:t>Ovládání může být v budoucnu upraveno v nastavení hry.</w:t>
       </w:r>
@@ -787,15 +686,7 @@
     </w:p>
     <w:p>
       <w:r>
-        <w:t>Postava se může pohybovat do stran a skákat. V průběhu hry může hráč získat další schopnosti, například dvojskok nebo rychlý úskok (</w:t>
-      </w:r>
-      <w:proofErr w:type="spellStart"/>
-      <w:r>
-        <w:t>dash</w:t>
-      </w:r>
-      <w:proofErr w:type="spellEnd"/>
-      <w:r>
-        <w:t>), které umožňují překonávat větší vzdálenosti a nové překážky.</w:t>
+        <w:t>Postava se může pohybovat do stran a skákat. V průběhu hry může hráč získat další schopnosti, například dvojskok nebo rychlý úskok (dash), které umožňují překonávat větší vzdálenosti a nové překážky.</w:t>
       </w:r>
     </w:p>
     <w:p>
@@ -821,20 +712,18 @@
         <w:pStyle w:val="Nadpis3"/>
       </w:pPr>
       <w:r>
-        <w:t xml:space="preserve">7.3 Systém duší (Soul </w:t>
-      </w:r>
-      <w:proofErr w:type="spellStart"/>
-      <w:r>
-        <w:t>System</w:t>
-      </w:r>
-      <w:proofErr w:type="spellEnd"/>
-      <w:r>
-        <w:t>)</w:t>
-      </w:r>
-    </w:p>
-    <w:p>
-      <w:r>
-        <w:t>Po poražení nepřátel získává hráč fragmenty duše. Tyto fragmenty představují herní měnu a symbolizují postupný růst postavy.</w:t>
+        <w:t>7.3 Systém duší (Soul System)</w:t>
+      </w:r>
+    </w:p>
+    <w:p>
+      <w:r>
+        <w:t>Po poražení nepřátel získává hráč fragmenty duše. Tyto fragmenty představují herní měnu a symbolizují postupný růst postavy</w:t>
+      </w:r>
+      <w:r>
+        <w:t xml:space="preserve"> (hlavně fragmenty bossů)</w:t>
+      </w:r>
+      <w:r>
+        <w:t>.</w:t>
       </w:r>
     </w:p>
     <w:p>
@@ -961,7 +850,7 @@
     </w:p>
     <w:p>
       <w:r>
-        <w:t>Hra využívá systém ukládání postupu (automatické ukládání nebo kontrolní body – uprav podle reality).</w:t>
+        <w:t xml:space="preserve">Hra využívá systém ukládání postupu </w:t>
       </w:r>
     </w:p>
     <w:p>
@@ -1053,22 +942,6 @@
       </w:r>
     </w:p>
     <w:p>
-      <w:r>
-        <w:t>Nízký výkon:</w:t>
-      </w:r>
-    </w:p>
-    <w:p>
-      <w:pPr>
-        <w:numPr>
-          <w:ilvl w:val="0"/>
-          <w:numId w:val="9"/>
-        </w:numPr>
-      </w:pPr>
-      <w:r>
-        <w:t>Zavřete ostatní aplikace běžící na pozadí.</w:t>
-      </w:r>
-    </w:p>
-    <w:p>
       <w:pPr>
         <w:pStyle w:val="Nadpis2"/>
       </w:pPr>
@@ -1077,52 +950,11 @@
       </w:r>
     </w:p>
     <w:p>
-      <w:proofErr w:type="spellStart"/>
-      <w:r>
-        <w:t>Neonexa</w:t>
-      </w:r>
-      <w:proofErr w:type="spellEnd"/>
-      <w:r>
-        <w:t xml:space="preserve"> je maturitní projekt vytvořený v herním </w:t>
-      </w:r>
-      <w:proofErr w:type="spellStart"/>
-      <w:r>
-        <w:t>enginu</w:t>
-      </w:r>
-      <w:proofErr w:type="spellEnd"/>
-      <w:r>
-        <w:t xml:space="preserve"> Godot. Cílem bylo vytvořit funkční </w:t>
-      </w:r>
-      <w:proofErr w:type="gramStart"/>
-      <w:r>
-        <w:t>2D</w:t>
-      </w:r>
-      <w:proofErr w:type="gramEnd"/>
-      <w:r>
-        <w:t xml:space="preserve"> akční </w:t>
-      </w:r>
-      <w:proofErr w:type="spellStart"/>
-      <w:r>
-        <w:t>adventuru</w:t>
-      </w:r>
-      <w:proofErr w:type="spellEnd"/>
-      <w:r>
-        <w:t xml:space="preserve"> s důrazem na atmosféru, příběh a postupné odemykání schopností.</w:t>
-      </w:r>
-    </w:p>
-    <w:p>
-      <w:r>
-        <w:t xml:space="preserve">Projekt demonstruje znalosti z oblasti herního designu, programování a práce s herním </w:t>
-      </w:r>
-      <w:proofErr w:type="spellStart"/>
-      <w:r>
-        <w:t>enginem</w:t>
-      </w:r>
-      <w:proofErr w:type="spellEnd"/>
-      <w:r>
-        <w:t>.</w:t>
-      </w:r>
-    </w:p>
+      <w:r>
+        <w:t>Neonexa je maturitní projekt vytvořený v herním enginu Godot. Cílem bylo vytvořit funkční 2D akční adventuru s důrazem na atmosféru, příběh a postupné odemykání schopností.</w:t>
+      </w:r>
+    </w:p>
+    <w:p/>
     <w:sectPr>
       <w:pgSz w:w="11906" w:h="16838"/>
       <w:pgMar w:top="1417" w:right="1417" w:bottom="1417" w:left="1417" w:header="708" w:footer="708" w:gutter="0"/>
@@ -3071,6 +2903,7 @@
   <w:style w:type="character" w:default="1" w:styleId="Standardnpsmoodstavce">
     <w:name w:val="Default Paragraph Font"/>
     <w:uiPriority w:val="1"/>
+    <w:semiHidden/>
     <w:unhideWhenUsed/>
   </w:style>
   <w:style w:type="table" w:default="1" w:styleId="Normlntabulka">

</xml_diff>